<commit_message>
Microsoft Office fixtures re-saved after the rename; last ox leftovers fixed
- examples/hello-table/fixtures/*.msoffice-flow-*: the maintainer's seven saves (Excel 16.03, Word and
  PowerPoint 16.0 for Mac) from fresh Demo B exports; last-modified-by Milleleaf, folder path
  trimmed to ~/.
- run.sh and tools/inventory/roundtrip.sh called target/debug/ox; the binary is now mleaf.
- README, model.rs and schema/mleaf.tsp still named schema/ox.tsp.

Box: Rust tests 192 passed, 0 failed, 9 ignored; run.sh steps 1-19 exit 0; site build, CSP,
typecheck, check, check-compare, check-privacy and check-flow exit 0.
</commit_message>
<xml_diff>
--- a/examples/hello-table/fixtures/report.msoffice-flow-edited.docx
+++ b/examples/hello-table/fixtures/report.msoffice-flow-edited.docx
@@ -4,8 +4,8 @@
   <w:body>
     <w:sdt>
       <w:sdtPr>
-        <w:tag w:val="ox:flow-report-title"/>
-        <w:id w:val="1377658871"/>
+        <w:tag w:val="mleaf:flow-report-title"/>
+        <w:id w:val="-1897959898"/>
       </w:sdtPr>
       <w:sdtContent>
         <w:p>
@@ -13,7 +13,10 @@
             <w:pStyle w:val="Heading1"/>
           </w:pPr>
           <w:r>
-            <w:t>Workbook report reviewed</w:t>
+            <w:t>Workbook report</w:t>
+          </w:r>
+          <w:r>
+            <w:t xml:space="preserve"> reviewed in Word</w:t>
           </w:r>
         </w:p>
       </w:sdtContent>
@@ -21,8 +24,8 @@
     <w:sdt>
       <w:sdtPr>
         <w:alias w:val="Linked: flow-source-table"/>
-        <w:tag w:val="ox:flow-report-table"/>
-        <w:id w:val="-682355799"/>
+        <w:tag w:val="mleaf:flow-report-table"/>
+        <w:id w:val="194129420"/>
         <w:lock w:val="contentLocked"/>
       </w:sdtPr>
       <w:sdtEndPr>
@@ -167,8 +170,8 @@
     </w:sdt>
     <w:sdt>
       <w:sdtPr>
-        <w:tag w:val="ox:flow-report-table#caption"/>
-        <w:id w:val="-2051907367"/>
+        <w:tag w:val="mleaf:flow-report-table#caption"/>
+        <w:id w:val="-868907437"/>
       </w:sdtPr>
       <w:sdtContent>
         <w:p>
@@ -183,8 +186,8 @@
     </w:sdt>
     <w:sdt>
       <w:sdtPr>
-        <w:tag w:val="ox:flow-report-chart"/>
-        <w:id w:val="-1231696039"/>
+        <w:tag w:val="mleaf:flow-report-chart"/>
+        <w:id w:val="2093355533"/>
       </w:sdtPr>
       <w:sdtContent>
         <w:p>
@@ -193,7 +196,7 @@
               <w:noProof/>
             </w:rPr>
             <w:drawing>
-              <wp:inline distT="0" distB="0" distL="0" distR="0" wp14:anchorId="3F5ED9F8" wp14:editId="34DCDE41">
+              <wp:inline distT="0" distB="0" distL="0" distR="0" wp14:anchorId="2A02FAEA" wp14:editId="4F60A0D3">
                 <wp:extent cx="5842000" cy="3081655"/>
                 <wp:effectExtent l="0" t="0" r="0" b="0"/>
                 <wp:docPr id="1" name="Picture 1" descr="Workbook chart"/>

</xml_diff>